<commit_message>
feat: master prompt template v8 history entry (R8.45), rebuilt BPMN prompt skill + zip, skill documentation (md/docx), test adjustments for R8.45
Co-Authored-By: Claude Sonnet 5.5 <noreply@anthropic.com>
</commit_message>
<xml_diff>
--- a/diagramatix/new features/diagramatix-bpmn-prompt-skill/diagramatix-bpmn-prompt-skill-documentation.docx
+++ b/diagramatix/new features/diagramatix-bpmn-prompt-skill/diagramatix-bpmn-prompt-skill-documentation.docx
@@ -44,7 +44,7 @@
           <w:b/>
           <w:bCs/>
         </w:rPr>
-        <w:t xml:space="preserve">Version 1 · 7 October 2026 · built from Diagramatix master template v7</w:t>
+        <w:t xml:space="preserve">Version 1 · 7 October 2026 · built from Diagramatix master template v8</w:t>
       </w:r>
     </w:p>
     <w:bookmarkStart w:id="9" w:name="contents"/>
@@ -2516,7 +2516,7 @@
                 <w:b/>
                 <w:bCs/>
               </w:rPr>
-              <w:t xml:space="preserve">v7</w:t>
+              <w:t xml:space="preserve">v8</w:t>
             </w:r>
             <w:r>
               <w:t xml:space="preserve">); a new zip is issued when the template changes.</w:t>
@@ -2984,7 +2984,17 @@
               <w:t xml:space="preserve"> </w:t>
             </w:r>
             <w:r>
-              <w:t xml:space="preserve">only; the exception path says where it goes and never returns to its host.</w:t>
+              <w:t xml:space="preserve">only; the exception path says where it goes and never returns to its host;</w:t>
+            </w:r>
+            <w:r>
+              <w:t xml:space="preserve"> </w:t>
+            </w:r>
+            <w:r>
+              <w:rPr>
+                <w:b/>
+                <w:bCs/>
+              </w:rPr>
+              <w:t xml:space="preserve">an event on a step inside an Expanded Subprocess leads only to another step inside it — to leave, mount the event on the Expanded Subprocess itself.</w:t>
             </w:r>
           </w:p>
         </w:tc>
@@ -4203,13 +4213,13 @@
           <w:b/>
           <w:bCs/>
         </w:rPr>
-        <w:t xml:space="preserve">The checks catch three kinds of defect automatically</w:t>
-      </w:r>
-      <w:r>
-        <w:t xml:space="preserve"> </w:t>
-      </w:r>
-      <w:r>
-        <w:t xml:space="preserve">— branches that never say where they go, boundary events mounted on something that is not an activity, and message flows between two lanes — plus structural problems (sections missing or out of order, a Data Store, a loop-back,</w:t>
+        <w:t xml:space="preserve">The checks catch four kinds of defect automatically</w:t>
+      </w:r>
+      <w:r>
+        <w:t xml:space="preserve"> </w:t>
+      </w:r>
+      <w:r>
+        <w:t xml:space="preserve">— branches that never say where they go, boundary events mounted on something that is not an activity, boundary events on a step inside a subprocess whose path leads out of it, and message flows between two lanes — plus structural problems (sections missing or out of order, a Data Store, a loop-back,</w:t>
       </w:r>
       <w:r>
         <w:t xml:space="preserve"> </w:t>
@@ -6200,6 +6210,65 @@
               <w:rPr>
                 <w:rStyle w:val="VerbatimChar"/>
               </w:rPr>
+              <w:t xml:space="preserve">boundary-leaves-subprocess</w:t>
+            </w:r>
+          </w:p>
+        </w:tc>
+        <w:tc>
+          <w:tcPr/>
+          <w:p>
+            <w:pPr>
+              <w:pStyle w:val="Compact"/>
+            </w:pPr>
+            <w:r>
+              <w:t xml:space="preserve">A boundary event on a step</w:t>
+            </w:r>
+            <w:r>
+              <w:t xml:space="preserve"> </w:t>
+            </w:r>
+            <w:r>
+              <w:rPr>
+                <w:i/>
+                <w:iCs/>
+              </w:rPr>
+              <w:t xml:space="preserve">inside</w:t>
+            </w:r>
+            <w:r>
+              <w:t xml:space="preserve"> </w:t>
+            </w:r>
+            <w:r>
+              <w:t xml:space="preserve">an Expanded Subprocess whose exception path leads</w:t>
+            </w:r>
+            <w:r>
+              <w:t xml:space="preserve"> </w:t>
+            </w:r>
+            <w:r>
+              <w:rPr>
+                <w:i/>
+                <w:iCs/>
+              </w:rPr>
+              <w:t xml:space="preserve">out</w:t>
+            </w:r>
+            <w:r>
+              <w:t xml:space="preserve"> </w:t>
+            </w:r>
+            <w:r>
+              <w:t xml:space="preserve">of it. Mount the event on the Expanded Subprocess itself.</w:t>
+            </w:r>
+          </w:p>
+        </w:tc>
+      </w:tr>
+      <w:tr>
+        <w:tc>
+          <w:tcPr/>
+          <w:p>
+            <w:pPr>
+              <w:pStyle w:val="Compact"/>
+            </w:pPr>
+            <w:r>
+              <w:rPr>
+                <w:rStyle w:val="VerbatimChar"/>
+              </w:rPr>
               <w:t xml:space="preserve">message-within-pool</w:t>
             </w:r>
           </w:p>
@@ -6422,7 +6491,7 @@
         <w:t xml:space="preserve"> </w:t>
       </w:r>
       <w:r>
-        <w:t xml:space="preserve">otherwise. The first three kinds are</w:t>
+        <w:t xml:space="preserve">otherwise. The first four kinds are</w:t>
       </w:r>
       <w:r>
         <w:t xml:space="preserve"> </w:t>
@@ -10780,6 +10849,62 @@
       </w:r>
       <w:r>
         <w:t xml:space="preserve">.</w:t>
+      </w:r>
+    </w:p>
+    <w:p>
+      <w:pPr>
+        <w:pStyle w:val="BodyText"/>
+      </w:pPr>
+      <w:r>
+        <w:rPr>
+          <w:b/>
+          <w:bCs/>
+        </w:rPr>
+        <w:t xml:space="preserve">A timer on a step inside a loop, with a reminder path that leaves the loop.</w:t>
+      </w:r>
+      <w:r>
+        <w:t xml:space="preserve"> </w:t>
+      </w:r>
+      <w:r>
+        <w:t xml:space="preserve">This was the first real defect found in a skill-written prompt (7 October 2026): the timer was mounted on the</w:t>
+      </w:r>
+      <w:r>
+        <w:t xml:space="preserve"> </w:t>
+      </w:r>
+      <w:r>
+        <w:rPr>
+          <w:i/>
+          <w:iCs/>
+        </w:rPr>
+        <w:t xml:space="preserve">wait inside</w:t>
+      </w:r>
+      <w:r>
+        <w:t xml:space="preserve"> </w:t>
+      </w:r>
+      <w:r>
+        <w:t xml:space="preserve">the loop but its path led out to a reminder outside. BPMN does not allow it — an event on a step inside an Expanded Subprocess may lead only to another step inside it. The fix is to mount the timer on the loop</w:t>
+      </w:r>
+      <w:r>
+        <w:t xml:space="preserve"> </w:t>
+      </w:r>
+      <w:r>
+        <w:rPr>
+          <w:i/>
+          <w:iCs/>
+        </w:rPr>
+        <w:t xml:space="preserve">itself</w:t>
+      </w:r>
+      <w:r>
+        <w:t xml:space="preserve">, with the return path coming back to the loop by name. This is now in the master template (v8), in the skill’s checklist and checker (</w:t>
+      </w:r>
+      <w:r>
+        <w:rPr>
+          <w:rStyle w:val="VerbatimChar"/>
+        </w:rPr>
+        <w:t xml:space="preserve">boundary-leaves-subprocess</w:t>
+      </w:r>
+      <w:r>
+        <w:t xml:space="preserve">), and enforced by Diagramatix’s layout (rule R8.45), which re-mounts such an event automatically.</w:t>
       </w:r>
     </w:p>
     <w:p>
@@ -11395,6 +11520,41 @@
             </w:pPr>
             <w:r>
               <w:t xml:space="preserve">A loop subprocess holds only the steps that repeat; its condition is about the repeating work, not the outcome.</w:t>
+            </w:r>
+          </w:p>
+        </w:tc>
+      </w:tr>
+      <w:tr>
+        <w:tc>
+          <w:tcPr/>
+          <w:p>
+            <w:pPr>
+              <w:pStyle w:val="Compact"/>
+            </w:pPr>
+            <w:r>
+              <w:t xml:space="preserve">8</w:t>
+            </w:r>
+          </w:p>
+        </w:tc>
+        <w:tc>
+          <w:tcPr/>
+          <w:p>
+            <w:pPr>
+              <w:pStyle w:val="Compact"/>
+            </w:pPr>
+            <w:r>
+              <w:t xml:space="preserve">2026-10-07</w:t>
+            </w:r>
+          </w:p>
+        </w:tc>
+        <w:tc>
+          <w:tcPr/>
+          <w:p>
+            <w:pPr>
+              <w:pStyle w:val="Compact"/>
+            </w:pPr>
+            <w:r>
+              <w:t xml:space="preserve">A boundary event on a step inside an Expanded Subprocess stays inside it: its exception path may lead only to another step in that subprocess. To leave, mount the event on the Expanded Subprocess itself, and bring any return path back to the subprocess by name (rule R8.45).</w:t>
             </w:r>
           </w:p>
         </w:tc>

</xml_diff>

<commit_message>
feat: BPMN prompt skill v9 — an exception never ends silently (history entry, rebuilt skill + zip, checklist item, example adjusted to the rule, documentation md/docx)
Co-Authored-By: Claude Sonnet 5.5 <noreply@anthropic.com>
</commit_message>
<xml_diff>
--- a/diagramatix/new features/diagramatix-bpmn-prompt-skill/diagramatix-bpmn-prompt-skill-documentation.docx
+++ b/diagramatix/new features/diagramatix-bpmn-prompt-skill/diagramatix-bpmn-prompt-skill-documentation.docx
@@ -44,7 +44,7 @@
           <w:b/>
           <w:bCs/>
         </w:rPr>
-        <w:t xml:space="preserve">Version 1 · 7 October 2026 · built from Diagramatix master template v8</w:t>
+        <w:t xml:space="preserve">Version 1 · updated 8 October 2026 · built from Diagramatix master template v9</w:t>
       </w:r>
     </w:p>
     <w:bookmarkStart w:id="9" w:name="contents"/>
@@ -2516,7 +2516,7 @@
                 <w:b/>
                 <w:bCs/>
               </w:rPr>
-              <w:t xml:space="preserve">v8</w:t>
+              <w:t xml:space="preserve">v9</w:t>
             </w:r>
             <w:r>
               <w:t xml:space="preserve">); a new zip is issued when the template changes.</w:t>
@@ -2996,6 +2996,16 @@
               </w:rPr>
               <w:t xml:space="preserve">an event on a step inside an Expanded Subprocess leads only to another step inside it — to leave, mount the event on the Expanded Subprocess itself.</w:t>
             </w:r>
+            <w:r>
+              <w:t xml:space="preserve"> </w:t>
+            </w:r>
+            <w:r>
+              <w:rPr>
+                <w:b/>
+                <w:bCs/>
+              </w:rPr>
+              <w:t xml:space="preserve">An exception never ends silently: a task sits between the event and an End event, and that End event is a Terminate End event.</w:t>
+            </w:r>
           </w:p>
         </w:tc>
       </w:tr>
@@ -6269,6 +6279,85 @@
               <w:rPr>
                 <w:rStyle w:val="VerbatimChar"/>
               </w:rPr>
+              <w:t xml:space="preserve">boundary-straight-to-end</w:t>
+            </w:r>
+          </w:p>
+        </w:tc>
+        <w:tc>
+          <w:tcPr/>
+          <w:p>
+            <w:pPr>
+              <w:pStyle w:val="Compact"/>
+            </w:pPr>
+            <w:r>
+              <w:t xml:space="preserve">A boundary event whose path goes straight to an End event — a</w:t>
+            </w:r>
+            <w:r>
+              <w:t xml:space="preserve"> </w:t>
+            </w:r>
+            <w:r>
+              <w:rPr>
+                <w:i/>
+                <w:iCs/>
+              </w:rPr>
+              <w:t xml:space="preserve">silent failure</w:t>
+            </w:r>
+            <w:r>
+              <w:t xml:space="preserve">. Put a task between them: the event triggers a User task, which then ends in the End event.</w:t>
+            </w:r>
+          </w:p>
+        </w:tc>
+      </w:tr>
+      <w:tr>
+        <w:tc>
+          <w:tcPr/>
+          <w:p>
+            <w:pPr>
+              <w:pStyle w:val="Compact"/>
+            </w:pPr>
+            <w:r>
+              <w:rPr>
+                <w:rStyle w:val="VerbatimChar"/>
+              </w:rPr>
+              <w:t xml:space="preserve">exception-end-not-terminate</w:t>
+            </w:r>
+          </w:p>
+        </w:tc>
+        <w:tc>
+          <w:tcPr/>
+          <w:p>
+            <w:pPr>
+              <w:pStyle w:val="Compact"/>
+            </w:pPr>
+            <w:r>
+              <w:t xml:space="preserve">The End event that finishes an exception path is not written as a</w:t>
+            </w:r>
+            <w:r>
+              <w:t xml:space="preserve"> </w:t>
+            </w:r>
+            <w:r>
+              <w:rPr>
+                <w:rStyle w:val="VerbatimChar"/>
+              </w:rPr>
+              <w:t xml:space="preserve">Terminate End event</w:t>
+            </w:r>
+            <w:r>
+              <w:t xml:space="preserve">.</w:t>
+            </w:r>
+          </w:p>
+        </w:tc>
+      </w:tr>
+      <w:tr>
+        <w:tc>
+          <w:tcPr/>
+          <w:p>
+            <w:pPr>
+              <w:pStyle w:val="Compact"/>
+            </w:pPr>
+            <w:r>
+              <w:rPr>
+                <w:rStyle w:val="VerbatimChar"/>
+              </w:rPr>
               <w:t xml:space="preserve">message-within-pool</w:t>
             </w:r>
           </w:p>
@@ -10905,6 +10994,83 @@
       </w:r>
       <w:r>
         <w:t xml:space="preserve">), and enforced by Diagramatix’s layout (rule R8.45), which re-mounts such an event automatically.</w:t>
+      </w:r>
+    </w:p>
+    <w:p>
+      <w:pPr>
+        <w:pStyle w:val="BodyText"/>
+      </w:pPr>
+      <w:r>
+        <w:rPr>
+          <w:b/>
+          <w:bCs/>
+        </w:rPr>
+        <w:t xml:space="preserve">An exception path that goes straight to an End event.</w:t>
+      </w:r>
+      <w:r>
+        <w:t xml:space="preserve"> </w:t>
+      </w:r>
+      <w:r>
+        <w:t xml:space="preserve">Template v9 (8 October 2026): the skill writes a</w:t>
+      </w:r>
+      <w:r>
+        <w:t xml:space="preserve"> </w:t>
+      </w:r>
+      <w:r>
+        <w:rPr>
+          <w:i/>
+          <w:iCs/>
+        </w:rPr>
+        <w:t xml:space="preserve">task</w:t>
+      </w:r>
+      <w:r>
+        <w:t xml:space="preserve"> </w:t>
+      </w:r>
+      <w:r>
+        <w:t xml:space="preserve">between a boundary event and an End event, and makes the End event a</w:t>
+      </w:r>
+      <w:r>
+        <w:t xml:space="preserve"> </w:t>
+      </w:r>
+      <w:r>
+        <w:rPr>
+          <w:i/>
+          <w:iCs/>
+        </w:rPr>
+        <w:t xml:space="preserve">Terminate End event</w:t>
+      </w:r>
+      <w:r>
+        <w:t xml:space="preserve">. This is the</w:t>
+      </w:r>
+      <w:r>
+        <w:t xml:space="preserve"> </w:t>
+      </w:r>
+      <w:r>
+        <w:t xml:space="preserve">“silent failure”</w:t>
+      </w:r>
+      <w:r>
+        <w:t xml:space="preserve"> </w:t>
+      </w:r>
+      <w:r>
+        <w:t xml:space="preserve">rule (Diagramatix rules R8.47 and R8.48; scan checks B56 and B57): when the exception happens, something must ask a person to act, and the process then ends outright. Diagramatix itself repairs a prompt that omits it — it inserts a task called</w:t>
+      </w:r>
+      <w:r>
+        <w:t xml:space="preserve"> </w:t>
+      </w:r>
+      <w:r>
+        <w:t xml:space="preserve">“Handle:</w:t>
+      </w:r>
+      <w:r>
+        <w:t xml:space="preserve"> </w:t>
+      </w:r>
+      <w:r>
+        <w:t xml:space="preserve">”</w:t>
+      </w:r>
+      <w:r>
+        <w:t xml:space="preserve"> </w:t>
+      </w:r>
+      <w:r>
+        <w:t xml:space="preserve">and makes the End a Terminate — but a prompt that says it from the start gives the diagram you meant. The first of the two shipped examples was adjusted to follow it.</w:t>
       </w:r>
     </w:p>
     <w:p>
@@ -11555,6 +11721,41 @@
             </w:pPr>
             <w:r>
               <w:t xml:space="preserve">A boundary event on a step inside an Expanded Subprocess stays inside it: its exception path may lead only to another step in that subprocess. To leave, mount the event on the Expanded Subprocess itself, and bring any return path back to the subprocess by name (rule R8.45).</w:t>
+            </w:r>
+          </w:p>
+        </w:tc>
+      </w:tr>
+      <w:tr>
+        <w:tc>
+          <w:tcPr/>
+          <w:p>
+            <w:pPr>
+              <w:pStyle w:val="Compact"/>
+            </w:pPr>
+            <w:r>
+              <w:t xml:space="preserve">9</w:t>
+            </w:r>
+          </w:p>
+        </w:tc>
+        <w:tc>
+          <w:tcPr/>
+          <w:p>
+            <w:pPr>
+              <w:pStyle w:val="Compact"/>
+            </w:pPr>
+            <w:r>
+              <w:t xml:space="preserve">2026-10-08</w:t>
+            </w:r>
+          </w:p>
+        </w:tc>
+        <w:tc>
+          <w:tcPr/>
+          <w:p>
+            <w:pPr>
+              <w:pStyle w:val="Compact"/>
+            </w:pPr>
+            <w:r>
+              <w:t xml:space="preserve">An exception never ends silently: a boundary event’s path never goes straight to an End event — a task sits between them — and the End event that finishes an exception path is a Terminate End event (rules R8.47 / R8.48).</w:t>
             </w:r>
           </w:p>
         </w:tc>

</xml_diff>